<commit_message>
Record formal run and finalize manuscript layout
</commit_message>
<xml_diff>
--- a/manuscript/Limits_of_Task_Set_Reduction_EMSE_draft_v2.0.docx
+++ b/manuscript/Limits_of_Task_Set_Reduction_EMSE_draft_v2.0.docx
@@ -6390,6 +6390,47 @@
       </w:r>
     </w:p>
     <w:p>
+      <w:pPr>
+        <w:jc w:val="left"/>
+      </w:pPr>
+      <w:r>
+        <w:t xml:space="preserve">The formal GitHub Actions execution is run 32962316617 at commit </w:t>
+      </w:r>
+      <w:r>
+        <w:rPr>
+          <w:rFonts w:ascii="Consolas" w:hAnsi="Consolas"/>
+          <w:color w:val="1F4D78"/>
+          <w:sz w:val="19"/>
+        </w:rPr>
+        <w:t>eb3119b65cfb48ce758a5d9faea44c1cc6843cd2</w:t>
+      </w:r>
+      <w:r>
+        <w:t xml:space="preserve">. Its uploaded artifact, </w:t>
+      </w:r>
+      <w:r>
+        <w:rPr>
+          <w:rFonts w:ascii="Consolas" w:hAnsi="Consolas"/>
+          <w:color w:val="1F4D78"/>
+          <w:sz w:val="19"/>
+        </w:rPr>
+        <w:t>swe-bench-formal-discriminative-power-study</w:t>
+      </w:r>
+      <w:r>
+        <w:t xml:space="preserve">, has SHA-256 digest </w:t>
+      </w:r>
+      <w:r>
+        <w:rPr>
+          <w:rFonts w:ascii="Consolas" w:hAnsi="Consolas"/>
+          <w:color w:val="1F4D78"/>
+          <w:sz w:val="19"/>
+        </w:rPr>
+        <w:t>15338bb2fd7292f3e89959f3dcc672748702b99c04197757e07acbedfad37dcd</w:t>
+      </w:r>
+      <w:r>
+        <w:t>. The run completed successfully on 26 August 2026; the downloaded archive was independently hashed to the same value before extraction and table checking.</w:t>
+      </w:r>
+    </w:p>
+    <w:p>
       <w:pPr/>
       <w:r>
         <w:t>Eighteen unit tests cover metric boundaries, tie-aware top-k sets, exact subset sizes, source parsing, cluster handling, decision thresholds, and the non-monotone common-budget regression. The artifact contains 208 unique panel-scope-method-budget rows, no duplicate cells, and no missing primary rank metrics. The 500-task validator requires all 16 combinations of two panels, two scopes, and four methods; all reproduce τ_b=1, top-k Jaccard=1, and zero calibrated score error.</w:t>
@@ -6496,11 +6537,6 @@
       <w:pPr/>
       <w:r>
         <w:t>The observed non-monotonicity is consequential: a larger deterministic subset can fail after a smaller one passes. Common-budget decisions must therefore test one exact budget across every required panel and dependence scope rather than aggregate cell-specific minima. More broadly, benchmark subsets should be versioned, validated on later systems, and re-evaluated as tasks, harnesses, and system populations change. The result is not a recommended permanent subset of SWE-bench Verified, which is no longer a suitable frontier benchmark (OpenAI 2026). It is a reproducible warning about the limits of one-time benchmark compression and pointwise budget selection.</w:t>
-      </w:r>
-    </w:p>
-    <w:p>
-      <w:r>
-        <w:br w:type="page"/>
       </w:r>
     </w:p>
     <w:p>

</xml_diff>